<commit_message>
Add README.md for project documentation and usage instructions
</commit_message>
<xml_diff>
--- a/Templates/Template Report Inputs Form.docx
+++ b/Templates/Template Report Inputs Form.docx
@@ -415,8 +415,17 @@
                 <w:sz w:val="22"/>
                 <w:szCs w:val="22"/>
               </w:rPr>
-              <w:t>Cell Phone #:</w:t>
-            </w:r>
+              <w:t xml:space="preserve">Cell </w:t>
+            </w:r>
+            <w:proofErr w:type="gramStart"/>
+            <w:r>
+              <w:rPr>
+                <w:sz w:val="22"/>
+                <w:szCs w:val="22"/>
+              </w:rPr>
+              <w:t>Phone #:</w:t>
+            </w:r>
+            <w:proofErr w:type="gramEnd"/>
             <w:r>
               <w:rPr>
                 <w:sz w:val="22"/>
@@ -1770,6 +1779,7 @@
                 <w:szCs w:val="22"/>
               </w:rPr>
             </w:pPr>
+            <w:proofErr w:type="gramStart"/>
             <w:r>
               <w:rPr>
                 <w:rFonts w:ascii="Calibri" w:hAnsi="Calibri" w:cs="Calibri"/>
@@ -1784,7 +1794,16 @@
                 <w:sz w:val="22"/>
                 <w:szCs w:val="22"/>
               </w:rPr>
-              <w:t>ank 8383 grounding lug</w:t>
+              <w:t>ank</w:t>
+            </w:r>
+            <w:proofErr w:type="gramEnd"/>
+            <w:r>
+              <w:rPr>
+                <w:rFonts w:ascii="Calibri" w:hAnsi="Calibri" w:cs="Calibri"/>
+                <w:sz w:val="22"/>
+                <w:szCs w:val="22"/>
+              </w:rPr>
+              <w:t xml:space="preserve"> 8383 grounding lug</w:t>
             </w:r>
           </w:p>
         </w:tc>
@@ -1921,6 +1940,7 @@
                 <w:szCs w:val="22"/>
               </w:rPr>
             </w:pPr>
+            <w:proofErr w:type="gramStart"/>
             <w:r>
               <w:rPr>
                 <w:rFonts w:ascii="Calibri" w:hAnsi="Calibri" w:cs="Calibri"/>
@@ -1935,7 +1955,16 @@
                 <w:sz w:val="22"/>
                 <w:szCs w:val="22"/>
               </w:rPr>
-              <w:t>ank so and so delamination</w:t>
+              <w:t>ank</w:t>
+            </w:r>
+            <w:proofErr w:type="gramEnd"/>
+            <w:r>
+              <w:rPr>
+                <w:rFonts w:ascii="Calibri" w:hAnsi="Calibri" w:cs="Calibri"/>
+                <w:sz w:val="22"/>
+                <w:szCs w:val="22"/>
+              </w:rPr>
+              <w:t xml:space="preserve"> so and so delamination</w:t>
             </w:r>
           </w:p>
         </w:tc>
@@ -2035,6 +2064,7 @@
                 <w:szCs w:val="22"/>
               </w:rPr>
             </w:pPr>
+            <w:proofErr w:type="gramStart"/>
             <w:r>
               <w:rPr>
                 <w:rFonts w:ascii="Calibri" w:hAnsi="Calibri" w:cs="Calibri"/>
@@ -2049,7 +2079,16 @@
                 <w:sz w:val="22"/>
                 <w:szCs w:val="22"/>
               </w:rPr>
-              <w:t>elamination of train B</w:t>
+              <w:t>elamination</w:t>
+            </w:r>
+            <w:proofErr w:type="gramEnd"/>
+            <w:r>
+              <w:rPr>
+                <w:rFonts w:ascii="Calibri" w:hAnsi="Calibri" w:cs="Calibri"/>
+                <w:sz w:val="22"/>
+                <w:szCs w:val="22"/>
+              </w:rPr>
+              <w:t xml:space="preserve"> of train B</w:t>
             </w:r>
           </w:p>
         </w:tc>
@@ -2071,6 +2110,7 @@
                 <w:szCs w:val="22"/>
               </w:rPr>
             </w:pPr>
+            <w:proofErr w:type="gramStart"/>
             <w:r>
               <w:rPr>
                 <w:rFonts w:ascii="Calibri" w:hAnsi="Calibri" w:cs="Calibri"/>
@@ -2085,7 +2125,16 @@
                 <w:sz w:val="22"/>
                 <w:szCs w:val="22"/>
               </w:rPr>
-              <w:t>ank so and so train B delamination</w:t>
+              <w:t>ank</w:t>
+            </w:r>
+            <w:proofErr w:type="gramEnd"/>
+            <w:r>
+              <w:rPr>
+                <w:rFonts w:ascii="Calibri" w:hAnsi="Calibri" w:cs="Calibri"/>
+                <w:sz w:val="22"/>
+                <w:szCs w:val="22"/>
+              </w:rPr>
+              <w:t xml:space="preserve"> so and so train B delamination</w:t>
             </w:r>
           </w:p>
         </w:tc>

</xml_diff>

<commit_message>
Enhance input form automation: Add image insertion functionality and update environment configuration
</commit_message>
<xml_diff>
--- a/Templates/Template Report Inputs Form.docx
+++ b/Templates/Template Report Inputs Form.docx
@@ -1519,7 +1519,7 @@
                 <w:noProof/>
               </w:rPr>
               <w:drawing>
-                <wp:inline distT="0" distB="0" distL="0" distR="0" wp14:anchorId="408131E1" wp14:editId="37636E2A">
+                <wp:inline distT="0" distB="0" distL="0" distR="0" wp14:anchorId="408131E1" wp14:editId="3E6D5375">
                   <wp:extent cx="3295650" cy="2466975"/>
                   <wp:effectExtent l="0" t="0" r="0" b="9525"/>
                   <wp:docPr id="646050106" name="Picture 1"/>
@@ -1779,7 +1779,6 @@
                 <w:szCs w:val="22"/>
               </w:rPr>
             </w:pPr>
-            <w:proofErr w:type="gramStart"/>
             <w:r>
               <w:rPr>
                 <w:rFonts w:ascii="Calibri" w:hAnsi="Calibri" w:cs="Calibri"/>
@@ -1794,16 +1793,7 @@
                 <w:sz w:val="22"/>
                 <w:szCs w:val="22"/>
               </w:rPr>
-              <w:t>ank</w:t>
-            </w:r>
-            <w:proofErr w:type="gramEnd"/>
-            <w:r>
-              <w:rPr>
-                <w:rFonts w:ascii="Calibri" w:hAnsi="Calibri" w:cs="Calibri"/>
-                <w:sz w:val="22"/>
-                <w:szCs w:val="22"/>
-              </w:rPr>
-              <w:t xml:space="preserve"> 8383 grounding lug</w:t>
+              <w:t>ank 8383 grounding lug</w:t>
             </w:r>
           </w:p>
         </w:tc>
@@ -1940,7 +1930,6 @@
                 <w:szCs w:val="22"/>
               </w:rPr>
             </w:pPr>
-            <w:proofErr w:type="gramStart"/>
             <w:r>
               <w:rPr>
                 <w:rFonts w:ascii="Calibri" w:hAnsi="Calibri" w:cs="Calibri"/>
@@ -1955,16 +1944,7 @@
                 <w:sz w:val="22"/>
                 <w:szCs w:val="22"/>
               </w:rPr>
-              <w:t>ank</w:t>
-            </w:r>
-            <w:proofErr w:type="gramEnd"/>
-            <w:r>
-              <w:rPr>
-                <w:rFonts w:ascii="Calibri" w:hAnsi="Calibri" w:cs="Calibri"/>
-                <w:sz w:val="22"/>
-                <w:szCs w:val="22"/>
-              </w:rPr>
-              <w:t xml:space="preserve"> so and so delamination</w:t>
+              <w:t>ank so and so delamination</w:t>
             </w:r>
           </w:p>
         </w:tc>

</xml_diff>